<commit_message>
Add GitHub link to report
</commit_message>
<xml_diff>
--- a/report/E-commerce_Profitability_Analysis_Report.docx
+++ b/report/E-commerce_Profitability_Analysis_Report.docx
@@ -99,14 +99,6 @@
         </w:rPr>
         <w:t xml:space="preserve">Dashboard: </w:t>
       </w:r>
-      <w:r>
-        <w:rPr>
-          <w:color w:val="5B6270"/>
-          <w:sz w:val="20"/>
-          <w:szCs w:val="20"/>
-        </w:rPr>
-        <w:t/>
-      </w:r>
       <w:hyperlink r:id="rId7" w:history="1">
         <w:r>
           <w:rPr>
@@ -119,14 +111,6 @@
       </w:hyperlink>
       <w:r>
         <w:rPr>
-          <w:color w:val="5B6270"/>
-          <w:sz w:val="20"/>
-          <w:szCs w:val="20"/>
-        </w:rPr>
-        <w:t/>
-      </w:r>
-      <w:r>
-        <w:rPr>
           <w:b/>
           <w:bCs/>
           <w:sz w:val="20"/>
@@ -134,14 +118,18 @@
         </w:rPr>
         <w:t xml:space="preserve">     Code: </w:t>
       </w:r>
-      <w:r>
-        <w:rPr>
-          <w:color w:val="5B6270"/>
-          <w:sz w:val="20"/>
-          <w:szCs w:val="20"/>
-        </w:rPr>
-        <w:t>[GitHub repository link]</w:t>
-      </w:r>
+      <w:hyperlink r:id="rId8" w:history="1">
+        <w:r>
+          <w:rPr>
+            <w:rStyle w:val="Hyperlink"/>
+            <w:b/>
+            <w:bCs/>
+            <w:sz w:val="20"/>
+            <w:szCs w:val="20"/>
+          </w:rPr>
+          <w:t>View on GitHub</w:t>
+        </w:r>
+      </w:hyperlink>
     </w:p>
     <w:p>
       <w:pPr>
@@ -228,7 +216,7 @@
         <w:t xml:space="preserve">Product category is the real margin driver. </w:t>
       </w:r>
       <w:r>
-        <w:t xml:space="preserve">Excluding tax, margins range from 27.3% (Electronics, the largest category) to 50.7% (Grocery). Discounts are identical across categories (~17%); the difference comes from product cost, which takes 72 cents of every Electronics sales dollar.</w:t>
+        <w:t>Excluding tax, margins range from 27.3% (Electronics, the largest category) to 50.7% (Grocery). Discounts are identical across categories (~17%); the difference comes from product cost, which takes 72 cents of every Electronics sales dollar.</w:t>
       </w:r>
     </w:p>
     <w:p>
@@ -283,7 +271,7 @@
         <w:t xml:space="preserve">Recommendations: </w:t>
       </w:r>
       <w:r>
-        <w:t xml:space="preserve">(1) correct the profit metric before making regional decisions; (2) improve Electronics margin through supplier and pricing review, and grow high-margin categories; (3) focus marketing on increasing order frequency among existing repeat customers. Details are in Section 9.</w:t>
+        <w:t>(1) correct the profit metric before making regional decisions; (2) improve Electronics margin through supplier and pricing review, and grow high-margin categories; (3) focus marketing on increasing order frequency among existing repeat customers. Details are in Section 9.</w:t>
       </w:r>
     </w:p>
     <w:p>
@@ -300,7 +288,7 @@
         <w:spacing w:after="140" w:line="288" w:lineRule="auto"/>
       </w:pPr>
       <w:r>
-        <w:t xml:space="preserve">Revenue alone does not show how healthy a business is. A region, product or channel can sell a lot while keeping very little of each dollar as profit. Management needs to know where profit actually comes from before deciding where to invest.</w:t>
+        <w:t>Revenue alone does not show how healthy a business is. A region, product or channel can sell a lot while keeping very little of each dollar as profit. Management needs to know where profit actually comes from before deciding where to invest.</w:t>
       </w:r>
     </w:p>
     <w:p>
@@ -325,7 +313,7 @@
         <w:spacing w:after="80" w:line="276" w:lineRule="auto"/>
       </w:pPr>
       <w:r>
-        <w:t xml:space="preserve">Regions: Does the highest-revenue region also earn the highest margin? If not, why?</w:t>
+        <w:t>Regions: Does the highest-revenue region also earn the highest margin? If not, why?</w:t>
       </w:r>
     </w:p>
     <w:p>
@@ -427,12 +415,6 @@
         <w:gridCol w:w="3560"/>
       </w:tblGrid>
       <w:tr>
-        <w:tblPrEx>
-          <w:tblCellMar>
-            <w:top w:w="0" w:type="dxa"/>
-            <w:bottom w:w="0" w:type="dxa"/>
-          </w:tblCellMar>
-        </w:tblPrEx>
         <w:trPr>
           <w:tblHeader/>
         </w:trPr>
@@ -537,12 +519,6 @@
         </w:tc>
       </w:tr>
       <w:tr>
-        <w:tblPrEx>
-          <w:tblCellMar>
-            <w:top w:w="0" w:type="dxa"/>
-            <w:bottom w:w="0" w:type="dxa"/>
-          </w:tblCellMar>
-        </w:tblPrEx>
         <w:trPr>
           <w:cantSplit/>
         </w:trPr>
@@ -638,12 +614,6 @@
         </w:tc>
       </w:tr>
       <w:tr>
-        <w:tblPrEx>
-          <w:tblCellMar>
-            <w:top w:w="0" w:type="dxa"/>
-            <w:bottom w:w="0" w:type="dxa"/>
-          </w:tblCellMar>
-        </w:tblPrEx>
         <w:trPr>
           <w:cantSplit/>
         </w:trPr>
@@ -739,12 +709,6 @@
         </w:tc>
       </w:tr>
       <w:tr>
-        <w:tblPrEx>
-          <w:tblCellMar>
-            <w:top w:w="0" w:type="dxa"/>
-            <w:bottom w:w="0" w:type="dxa"/>
-          </w:tblCellMar>
-        </w:tblPrEx>
         <w:trPr>
           <w:cantSplit/>
         </w:trPr>
@@ -843,7 +807,7 @@
           <w:sz w:val="18"/>
           <w:szCs w:val="18"/>
         </w:rPr>
-        <w:t xml:space="preserve">Table 1. Tables used in the analysis. All order items matched a product in the catalog.</w:t>
+        <w:t>Table 1. Tables used in the analysis. All order items matched a product in the catalog.</w:t>
       </w:r>
     </w:p>
     <w:p>
@@ -884,12 +848,6 @@
         <w:gridCol w:w="3000"/>
       </w:tblGrid>
       <w:tr>
-        <w:tblPrEx>
-          <w:tblCellMar>
-            <w:top w:w="0" w:type="dxa"/>
-            <w:bottom w:w="0" w:type="dxa"/>
-          </w:tblCellMar>
-        </w:tblPrEx>
         <w:trPr>
           <w:tblHeader/>
         </w:trPr>
@@ -962,12 +920,6 @@
         </w:tc>
       </w:tr>
       <w:tr>
-        <w:tblPrEx>
-          <w:tblCellMar>
-            <w:top w:w="0" w:type="dxa"/>
-            <w:bottom w:w="0" w:type="dxa"/>
-          </w:tblCellMar>
-        </w:tblPrEx>
         <w:trPr>
           <w:cantSplit/>
         </w:trPr>
@@ -1034,12 +986,6 @@
         </w:tc>
       </w:tr>
       <w:tr>
-        <w:tblPrEx>
-          <w:tblCellMar>
-            <w:top w:w="0" w:type="dxa"/>
-            <w:bottom w:w="0" w:type="dxa"/>
-          </w:tblCellMar>
-        </w:tblPrEx>
         <w:trPr>
           <w:cantSplit/>
         </w:trPr>
@@ -1106,12 +1052,6 @@
         </w:tc>
       </w:tr>
       <w:tr>
-        <w:tblPrEx>
-          <w:tblCellMar>
-            <w:top w:w="0" w:type="dxa"/>
-            <w:bottom w:w="0" w:type="dxa"/>
-          </w:tblCellMar>
-        </w:tblPrEx>
         <w:trPr>
           <w:cantSplit/>
         </w:trPr>
@@ -1178,12 +1118,6 @@
         </w:tc>
       </w:tr>
       <w:tr>
-        <w:tblPrEx>
-          <w:tblCellMar>
-            <w:top w:w="0" w:type="dxa"/>
-            <w:bottom w:w="0" w:type="dxa"/>
-          </w:tblCellMar>
-        </w:tblPrEx>
         <w:trPr>
           <w:cantSplit/>
         </w:trPr>
@@ -1267,7 +1201,7 @@
       </w:pPr>
       <w:r>
         <w:lastRenderedPageBreak/>
-        <w:t xml:space="preserve">Every record missing delivery days was also missing a customer rating. This is consistent with orders that were never delivered (for example, cancelled or not yet shipped) and therefore could not be rated. These rows were kept for financial analysis and excluded only from rating analysis.</w:t>
+        <w:t>Every record missing delivery days was also missing a customer rating. This is consistent with orders that were never delivered (for example, cancelled or not yet shipped) and therefore could not be rated. These rows were kept for financial analysis and excluded only from rating analysis.</w:t>
       </w:r>
     </w:p>
     <w:p>
@@ -1314,7 +1248,7 @@
         <w:spacing w:after="80" w:line="276" w:lineRule="auto"/>
       </w:pPr>
       <w:r>
-        <w:t xml:space="preserve">Verified the clean table has the same row count as the raw table, and that every order item matches a product.</w:t>
+        <w:t>Verified the clean table has the same row count as the raw table, and that every order item matches a product.</w:t>
       </w:r>
     </w:p>
     <w:p>
@@ -1360,12 +1294,6 @@
         <w:gridCol w:w="6460"/>
       </w:tblGrid>
       <w:tr>
-        <w:tblPrEx>
-          <w:tblCellMar>
-            <w:top w:w="0" w:type="dxa"/>
-            <w:bottom w:w="0" w:type="dxa"/>
-          </w:tblCellMar>
-        </w:tblPrEx>
         <w:trPr>
           <w:tblHeader/>
         </w:trPr>
@@ -1437,12 +1365,6 @@
         </w:tc>
       </w:tr>
       <w:tr>
-        <w:tblPrEx>
-          <w:tblCellMar>
-            <w:top w:w="0" w:type="dxa"/>
-            <w:bottom w:w="0" w:type="dxa"/>
-          </w:tblCellMar>
-        </w:tblPrEx>
         <w:trPr>
           <w:cantSplit/>
         </w:trPr>
@@ -1508,12 +1430,6 @@
         </w:tc>
       </w:tr>
       <w:tr>
-        <w:tblPrEx>
-          <w:tblCellMar>
-            <w:top w:w="0" w:type="dxa"/>
-            <w:bottom w:w="0" w:type="dxa"/>
-          </w:tblCellMar>
-        </w:tblPrEx>
         <w:trPr>
           <w:cantSplit/>
         </w:trPr>
@@ -1579,12 +1495,6 @@
         </w:tc>
       </w:tr>
       <w:tr>
-        <w:tblPrEx>
-          <w:tblCellMar>
-            <w:top w:w="0" w:type="dxa"/>
-            <w:bottom w:w="0" w:type="dxa"/>
-          </w:tblCellMar>
-        </w:tblPrEx>
         <w:trPr>
           <w:cantSplit/>
         </w:trPr>
@@ -1644,18 +1554,12 @@
                 <w:sz w:val="19"/>
                 <w:szCs w:val="19"/>
               </w:rPr>
-              <w:t xml:space="preserve">Net sales − product cost − shipping cost. Because net sales includes tax, reported profit does too.</w:t>
+              <w:t>Net sales − product cost − shipping cost. Because net sales includes tax, reported profit does too.</w:t>
             </w:r>
           </w:p>
         </w:tc>
       </w:tr>
       <w:tr>
-        <w:tblPrEx>
-          <w:tblCellMar>
-            <w:top w:w="0" w:type="dxa"/>
-            <w:bottom w:w="0" w:type="dxa"/>
-          </w:tblCellMar>
-        </w:tblPrEx>
         <w:trPr>
           <w:cantSplit/>
         </w:trPr>
@@ -1721,12 +1625,6 @@
         </w:tc>
       </w:tr>
       <w:tr>
-        <w:tblPrEx>
-          <w:tblCellMar>
-            <w:top w:w="0" w:type="dxa"/>
-            <w:bottom w:w="0" w:type="dxa"/>
-          </w:tblCellMar>
-        </w:tblPrEx>
         <w:trPr>
           <w:cantSplit/>
         </w:trPr>
@@ -1786,18 +1684,12 @@
                 <w:sz w:val="19"/>
                 <w:szCs w:val="19"/>
               </w:rPr>
-              <w:t xml:space="preserve">Profit ÷ revenue, calculated from totals (revenue-weighted), not as an average of row-level margins.</w:t>
+              <w:t>Profit ÷ revenue, calculated from totals (revenue-weighted), not as an average of row-level margins.</w:t>
             </w:r>
           </w:p>
         </w:tc>
       </w:tr>
       <w:tr>
-        <w:tblPrEx>
-          <w:tblCellMar>
-            <w:top w:w="0" w:type="dxa"/>
-            <w:bottom w:w="0" w:type="dxa"/>
-          </w:tblCellMar>
-        </w:tblPrEx>
         <w:trPr>
           <w:cantSplit/>
         </w:trPr>
@@ -1851,7 +1743,7 @@
                 <w:sz w:val="19"/>
                 <w:szCs w:val="19"/>
               </w:rPr>
-              <w:t xml:space="preserve">Dataset column, repeated on every order. Averaged at customer level (one row per customer) to avoid over-weighting frequent buyers.</w:t>
+              <w:t>Dataset column, repeated on every order. Averaged at customer level (one row per customer) to avoid over-weighting frequent buyers.</w:t>
             </w:r>
           </w:p>
         </w:tc>
@@ -1925,12 +1817,6 @@
         <w:gridCol w:w="3000"/>
       </w:tblGrid>
       <w:tr>
-        <w:tblPrEx>
-          <w:tblCellMar>
-            <w:top w:w="0" w:type="dxa"/>
-            <w:bottom w:w="0" w:type="dxa"/>
-          </w:tblCellMar>
-        </w:tblPrEx>
         <w:trPr>
           <w:tblHeader/>
         </w:trPr>
@@ -2037,12 +1923,6 @@
         </w:tc>
       </w:tr>
       <w:tr>
-        <w:tblPrEx>
-          <w:tblCellMar>
-            <w:top w:w="0" w:type="dxa"/>
-            <w:bottom w:w="0" w:type="dxa"/>
-          </w:tblCellMar>
-        </w:tblPrEx>
         <w:trPr>
           <w:cantSplit/>
         </w:trPr>
@@ -2143,12 +2023,6 @@
         </w:tc>
       </w:tr>
       <w:tr>
-        <w:tblPrEx>
-          <w:tblCellMar>
-            <w:top w:w="0" w:type="dxa"/>
-            <w:bottom w:w="0" w:type="dxa"/>
-          </w:tblCellMar>
-        </w:tblPrEx>
         <w:trPr>
           <w:cantSplit/>
         </w:trPr>
@@ -2249,12 +2123,6 @@
         </w:tc>
       </w:tr>
       <w:tr>
-        <w:tblPrEx>
-          <w:tblCellMar>
-            <w:top w:w="0" w:type="dxa"/>
-            <w:bottom w:w="0" w:type="dxa"/>
-          </w:tblCellMar>
-        </w:tblPrEx>
         <w:trPr>
           <w:cantSplit/>
         </w:trPr>
@@ -2355,12 +2223,6 @@
         </w:tc>
       </w:tr>
       <w:tr>
-        <w:tblPrEx>
-          <w:tblCellMar>
-            <w:top w:w="0" w:type="dxa"/>
-            <w:bottom w:w="0" w:type="dxa"/>
-          </w:tblCellMar>
-        </w:tblPrEx>
         <w:trPr>
           <w:cantSplit/>
         </w:trPr>
@@ -2461,12 +2323,6 @@
         </w:tc>
       </w:tr>
       <w:tr>
-        <w:tblPrEx>
-          <w:tblCellMar>
-            <w:top w:w="0" w:type="dxa"/>
-            <w:bottom w:w="0" w:type="dxa"/>
-          </w:tblCellMar>
-        </w:tblPrEx>
         <w:trPr>
           <w:cantSplit/>
         </w:trPr>
@@ -2564,12 +2420,6 @@
         </w:tc>
       </w:tr>
       <w:tr>
-        <w:tblPrEx>
-          <w:tblCellMar>
-            <w:top w:w="0" w:type="dxa"/>
-            <w:bottom w:w="0" w:type="dxa"/>
-          </w:tblCellMar>
-        </w:tblPrEx>
         <w:trPr>
           <w:cantSplit/>
         </w:trPr>
@@ -2667,12 +2517,6 @@
         </w:tc>
       </w:tr>
       <w:tr>
-        <w:tblPrEx>
-          <w:tblCellMar>
-            <w:top w:w="0" w:type="dxa"/>
-            <w:bottom w:w="0" w:type="dxa"/>
-          </w:tblCellMar>
-        </w:tblPrEx>
         <w:trPr>
           <w:cantSplit/>
         </w:trPr>
@@ -2770,12 +2614,6 @@
         </w:tc>
       </w:tr>
       <w:tr>
-        <w:tblPrEx>
-          <w:tblCellMar>
-            <w:top w:w="0" w:type="dxa"/>
-            <w:bottom w:w="0" w:type="dxa"/>
-          </w:tblCellMar>
-        </w:tblPrEx>
         <w:trPr>
           <w:cantSplit/>
         </w:trPr>
@@ -2897,6 +2735,9 @@
         <w:jc w:val="center"/>
       </w:pPr>
       <w:r>
+        <w:rPr>
+          <w:noProof/>
+        </w:rPr>
         <w:drawing>
           <wp:inline distT="0" distB="0" distL="0" distR="0" wp14:anchorId="6B422E79" wp14:editId="20E42537">
             <wp:extent cx="5943600" cy="525145"/>
@@ -2913,7 +2754,7 @@
                     <pic:cNvPicPr/>
                   </pic:nvPicPr>
                   <pic:blipFill>
-                    <a:blip r:embed="rId8"/>
+                    <a:blip r:embed="rId9"/>
                     <a:stretch>
                       <a:fillRect/>
                     </a:stretch>
@@ -2945,14 +2786,13 @@
       </w:pPr>
       <w:r>
         <w:rPr>
-          <w:rFonts w:ascii="Arial" w:hAnsi="Arial" w:cs="Arial"/>
           <w:i/>
           <w:iCs/>
           <w:color w:val="5B6270"/>
           <w:sz w:val="18"/>
           <w:szCs w:val="18"/>
         </w:rPr>
-        <w:t xml:space="preserve">Figure 1. KPI row from the Tableau dashboard.</w:t>
+        <w:t>Figure 1. KPI row from the Tableau dashboard.</w:t>
       </w:r>
     </w:p>
     <w:p>
@@ -2995,12 +2835,6 @@
         <w:gridCol w:w="2200"/>
       </w:tblGrid>
       <w:tr>
-        <w:tblPrEx>
-          <w:tblCellMar>
-            <w:top w:w="0" w:type="dxa"/>
-            <w:bottom w:w="0" w:type="dxa"/>
-          </w:tblCellMar>
-        </w:tblPrEx>
         <w:trPr>
           <w:tblHeader/>
         </w:trPr>
@@ -3141,12 +2975,6 @@
         </w:tc>
       </w:tr>
       <w:tr>
-        <w:tblPrEx>
-          <w:tblCellMar>
-            <w:top w:w="0" w:type="dxa"/>
-            <w:bottom w:w="0" w:type="dxa"/>
-          </w:tblCellMar>
-        </w:tblPrEx>
         <w:trPr>
           <w:cantSplit/>
         </w:trPr>
@@ -3275,12 +3103,6 @@
         </w:tc>
       </w:tr>
       <w:tr>
-        <w:tblPrEx>
-          <w:tblCellMar>
-            <w:top w:w="0" w:type="dxa"/>
-            <w:bottom w:w="0" w:type="dxa"/>
-          </w:tblCellMar>
-        </w:tblPrEx>
         <w:trPr>
           <w:cantSplit/>
         </w:trPr>
@@ -3409,12 +3231,6 @@
         </w:tc>
       </w:tr>
       <w:tr>
-        <w:tblPrEx>
-          <w:tblCellMar>
-            <w:top w:w="0" w:type="dxa"/>
-            <w:bottom w:w="0" w:type="dxa"/>
-          </w:tblCellMar>
-        </w:tblPrEx>
         <w:trPr>
           <w:cantSplit/>
         </w:trPr>
@@ -3543,12 +3359,6 @@
         </w:tc>
       </w:tr>
       <w:tr>
-        <w:tblPrEx>
-          <w:tblCellMar>
-            <w:top w:w="0" w:type="dxa"/>
-            <w:bottom w:w="0" w:type="dxa"/>
-          </w:tblCellMar>
-        </w:tblPrEx>
         <w:trPr>
           <w:cantSplit/>
         </w:trPr>
@@ -3677,12 +3487,6 @@
         </w:tc>
       </w:tr>
       <w:tr>
-        <w:tblPrEx>
-          <w:tblCellMar>
-            <w:top w:w="0" w:type="dxa"/>
-            <w:bottom w:w="0" w:type="dxa"/>
-          </w:tblCellMar>
-        </w:tblPrEx>
         <w:trPr>
           <w:cantSplit/>
         </w:trPr>
@@ -3825,7 +3629,7 @@
         <w:spacing w:after="140" w:line="288" w:lineRule="auto"/>
       </w:pPr>
       <w:r>
-        <w:t xml:space="preserve">South generates the most revenue and profit but keeps less of each dollar than North and West. On the reported numbers, the 4.8-point gap between North and East looks like a major efficiency difference worth replicating across regions. Before recommending that, the gap needed an explanation.</w:t>
+        <w:t>South generates the most revenue and profit but keeps less of each dollar than North and West. On the reported numbers, the 4.8-point gap between North and East looks like a major efficiency difference worth replicating across regions. Before recommending that, the gap needed an explanation.</w:t>
       </w:r>
     </w:p>
     <w:p>
@@ -3860,12 +3664,6 @@
         <w:gridCol w:w="1600"/>
       </w:tblGrid>
       <w:tr>
-        <w:tblPrEx>
-          <w:tblCellMar>
-            <w:top w:w="0" w:type="dxa"/>
-            <w:bottom w:w="0" w:type="dxa"/>
-          </w:tblCellMar>
-        </w:tblPrEx>
         <w:trPr>
           <w:tblHeader/>
         </w:trPr>
@@ -3970,12 +3768,6 @@
         </w:tc>
       </w:tr>
       <w:tr>
-        <w:tblPrEx>
-          <w:tblCellMar>
-            <w:top w:w="0" w:type="dxa"/>
-            <w:bottom w:w="0" w:type="dxa"/>
-          </w:tblCellMar>
-        </w:tblPrEx>
         <w:trPr>
           <w:cantSplit/>
         </w:trPr>
@@ -4071,12 +3863,6 @@
         </w:tc>
       </w:tr>
       <w:tr>
-        <w:tblPrEx>
-          <w:tblCellMar>
-            <w:top w:w="0" w:type="dxa"/>
-            <w:bottom w:w="0" w:type="dxa"/>
-          </w:tblCellMar>
-        </w:tblPrEx>
         <w:trPr>
           <w:cantSplit/>
         </w:trPr>
@@ -4172,12 +3958,6 @@
         </w:tc>
       </w:tr>
       <w:tr>
-        <w:tblPrEx>
-          <w:tblCellMar>
-            <w:top w:w="0" w:type="dxa"/>
-            <w:bottom w:w="0" w:type="dxa"/>
-          </w:tblCellMar>
-        </w:tblPrEx>
         <w:trPr>
           <w:cantSplit/>
         </w:trPr>
@@ -4273,12 +4053,6 @@
         </w:tc>
       </w:tr>
       <w:tr>
-        <w:tblPrEx>
-          <w:tblCellMar>
-            <w:top w:w="0" w:type="dxa"/>
-            <w:bottom w:w="0" w:type="dxa"/>
-          </w:tblCellMar>
-        </w:tblPrEx>
         <w:trPr>
           <w:cantSplit/>
         </w:trPr>
@@ -4374,12 +4148,6 @@
         </w:tc>
       </w:tr>
       <w:tr>
-        <w:tblPrEx>
-          <w:tblCellMar>
-            <w:top w:w="0" w:type="dxa"/>
-            <w:bottom w:w="0" w:type="dxa"/>
-          </w:tblCellMar>
-        </w:tblPrEx>
         <w:trPr>
           <w:cantSplit/>
         </w:trPr>
@@ -4475,12 +4243,6 @@
         </w:tc>
       </w:tr>
       <w:tr>
-        <w:tblPrEx>
-          <w:tblCellMar>
-            <w:top w:w="0" w:type="dxa"/>
-            <w:bottom w:w="0" w:type="dxa"/>
-          </w:tblCellMar>
-        </w:tblPrEx>
         <w:trPr>
           <w:cantSplit/>
         </w:trPr>
@@ -4579,7 +4341,7 @@
           <w:sz w:val="18"/>
           <w:szCs w:val="18"/>
         </w:rPr>
-        <w:t xml:space="preserve">Table 6. Six explanations were tested and ruled out.</w:t>
+        <w:t>Table 6. Six explanations were tested and ruled out.</w:t>
       </w:r>
     </w:p>
     <w:p>
@@ -4587,7 +4349,7 @@
         <w:spacing w:after="140" w:line="288" w:lineRule="auto"/>
       </w:pPr>
       <w:r>
-        <w:t xml:space="preserve">On the reported basis, product cost takes a larger share of each sales dollar in South, Central and East (56–57%) than in North and West (52–53%). It first looked like a sourcing problem. But since unit costs are identical, the difference had to come from the other side of the ratio: revenue per unit.</w:t>
+        <w:t>On the reported basis, product cost takes a larger share of each sales dollar in South, Central and East (56–57%) than in North and West (52–53%). It first looked like a sourcing problem. But since unit costs are identical, the difference had to come from the other side of the ratio: revenue per unit.</w:t>
       </w:r>
     </w:p>
     <w:p>
@@ -4625,12 +4387,6 @@
         <w:gridCol w:w="1340"/>
       </w:tblGrid>
       <w:tr>
-        <w:tblPrEx>
-          <w:tblCellMar>
-            <w:top w:w="0" w:type="dxa"/>
-            <w:bottom w:w="0" w:type="dxa"/>
-          </w:tblCellMar>
-        </w:tblPrEx>
         <w:trPr>
           <w:tblHeader/>
         </w:trPr>
@@ -4873,12 +4629,6 @@
         </w:tc>
       </w:tr>
       <w:tr>
-        <w:tblPrEx>
-          <w:tblCellMar>
-            <w:top w:w="0" w:type="dxa"/>
-            <w:bottom w:w="0" w:type="dxa"/>
-          </w:tblCellMar>
-        </w:tblPrEx>
         <w:trPr>
           <w:cantSplit/>
         </w:trPr>
@@ -5100,12 +4850,6 @@
         </w:tc>
       </w:tr>
       <w:tr>
-        <w:tblPrEx>
-          <w:tblCellMar>
-            <w:top w:w="0" w:type="dxa"/>
-            <w:bottom w:w="0" w:type="dxa"/>
-          </w:tblCellMar>
-        </w:tblPrEx>
         <w:trPr>
           <w:cantSplit/>
         </w:trPr>
@@ -5327,12 +5071,6 @@
         </w:tc>
       </w:tr>
       <w:tr>
-        <w:tblPrEx>
-          <w:tblCellMar>
-            <w:top w:w="0" w:type="dxa"/>
-            <w:bottom w:w="0" w:type="dxa"/>
-          </w:tblCellMar>
-        </w:tblPrEx>
         <w:trPr>
           <w:cantSplit/>
         </w:trPr>
@@ -5554,12 +5292,6 @@
         </w:tc>
       </w:tr>
       <w:tr>
-        <w:tblPrEx>
-          <w:tblCellMar>
-            <w:top w:w="0" w:type="dxa"/>
-            <w:bottom w:w="0" w:type="dxa"/>
-          </w:tblCellMar>
-        </w:tblPrEx>
         <w:trPr>
           <w:cantSplit/>
         </w:trPr>
@@ -5781,12 +5513,6 @@
         </w:tc>
       </w:tr>
       <w:tr>
-        <w:tblPrEx>
-          <w:tblCellMar>
-            <w:top w:w="0" w:type="dxa"/>
-            <w:bottom w:w="0" w:type="dxa"/>
-          </w:tblCellMar>
-        </w:tblPrEx>
         <w:trPr>
           <w:cantSplit/>
         </w:trPr>
@@ -6040,7 +5766,7 @@
         <w:t xml:space="preserve">Root cause: </w:t>
       </w:r>
       <w:r>
-        <w:t xml:space="preserve">Net sales, and therefore profit, include sales tax. Tax is collected on behalf of the government and is not revenue the business keeps. Regions with higher tax rates appear more profitable without being more efficient.</w:t>
+        <w:t>Net sales, and therefore profit, include sales tax. Tax is collected on behalf of the government and is not revenue the business keeps. Regions with higher tax rates appear more profitable without being more efficient.</w:t>
       </w:r>
     </w:p>
     <w:p>
@@ -6078,12 +5804,6 @@
         <w:gridCol w:w="1700"/>
       </w:tblGrid>
       <w:tr>
-        <w:tblPrEx>
-          <w:tblCellMar>
-            <w:top w:w="0" w:type="dxa"/>
-            <w:bottom w:w="0" w:type="dxa"/>
-          </w:tblCellMar>
-        </w:tblPrEx>
         <w:trPr>
           <w:tblHeader/>
         </w:trPr>
@@ -6292,12 +6012,6 @@
         </w:tc>
       </w:tr>
       <w:tr>
-        <w:tblPrEx>
-          <w:tblCellMar>
-            <w:top w:w="0" w:type="dxa"/>
-            <w:bottom w:w="0" w:type="dxa"/>
-          </w:tblCellMar>
-        </w:tblPrEx>
         <w:trPr>
           <w:cantSplit/>
         </w:trPr>
@@ -6488,12 +6202,6 @@
         </w:tc>
       </w:tr>
       <w:tr>
-        <w:tblPrEx>
-          <w:tblCellMar>
-            <w:top w:w="0" w:type="dxa"/>
-            <w:bottom w:w="0" w:type="dxa"/>
-          </w:tblCellMar>
-        </w:tblPrEx>
         <w:trPr>
           <w:cantSplit/>
         </w:trPr>
@@ -6684,12 +6392,6 @@
         </w:tc>
       </w:tr>
       <w:tr>
-        <w:tblPrEx>
-          <w:tblCellMar>
-            <w:top w:w="0" w:type="dxa"/>
-            <w:bottom w:w="0" w:type="dxa"/>
-          </w:tblCellMar>
-        </w:tblPrEx>
         <w:trPr>
           <w:cantSplit/>
         </w:trPr>
@@ -6880,12 +6582,6 @@
         </w:tc>
       </w:tr>
       <w:tr>
-        <w:tblPrEx>
-          <w:tblCellMar>
-            <w:top w:w="0" w:type="dxa"/>
-            <w:bottom w:w="0" w:type="dxa"/>
-          </w:tblCellMar>
-        </w:tblPrEx>
         <w:trPr>
           <w:cantSplit/>
         </w:trPr>
@@ -7076,12 +6772,6 @@
         </w:tc>
       </w:tr>
       <w:tr>
-        <w:tblPrEx>
-          <w:tblCellMar>
-            <w:top w:w="0" w:type="dxa"/>
-            <w:bottom w:w="0" w:type="dxa"/>
-          </w:tblCellMar>
-        </w:tblPrEx>
         <w:trPr>
           <w:cantSplit/>
         </w:trPr>
@@ -7294,6 +6984,9 @@
         <w:jc w:val="center"/>
       </w:pPr>
       <w:r>
+        <w:rPr>
+          <w:noProof/>
+        </w:rPr>
         <w:drawing>
           <wp:inline distT="0" distB="0" distL="0" distR="0" wp14:anchorId="580D9BE9" wp14:editId="611EFE44">
             <wp:extent cx="5943600" cy="1916430"/>
@@ -7310,7 +7003,7 @@
                     <pic:cNvPicPr/>
                   </pic:nvPicPr>
                   <pic:blipFill>
-                    <a:blip r:embed="rId9"/>
+                    <a:blip r:embed="rId10"/>
                     <a:stretch>
                       <a:fillRect/>
                     </a:stretch>
@@ -7342,14 +7035,13 @@
       </w:pPr>
       <w:r>
         <w:rPr>
-          <w:rFonts w:ascii="Arial" w:hAnsi="Arial" w:cs="Arial"/>
           <w:i/>
           <w:iCs/>
           <w:color w:val="5B6270"/>
           <w:sz w:val="18"/>
           <w:szCs w:val="18"/>
         </w:rPr>
-        <w:t xml:space="preserve">Figure 2. Revenue and margin by region.</w:t>
+        <w:t>Figure 2. Revenue and margin by region.</w:t>
       </w:r>
     </w:p>
     <w:p>
@@ -7357,6 +7049,7 @@
         <w:pStyle w:val="Heading1"/>
       </w:pPr>
       <w:r>
+        <w:lastRenderedPageBreak/>
         <w:t>6. Product Category Analysis</w:t>
       </w:r>
     </w:p>
@@ -7394,12 +7087,6 @@
         <w:gridCol w:w="1750"/>
       </w:tblGrid>
       <w:tr>
-        <w:tblPrEx>
-          <w:tblCellMar>
-            <w:top w:w="0" w:type="dxa"/>
-            <w:bottom w:w="0" w:type="dxa"/>
-          </w:tblCellMar>
-        </w:tblPrEx>
         <w:trPr>
           <w:tblHeader/>
         </w:trPr>
@@ -7432,7 +7119,6 @@
                 <w:sz w:val="19"/>
                 <w:szCs w:val="19"/>
               </w:rPr>
-              <w:lastRenderedPageBreak/>
               <w:t>Category</w:t>
             </w:r>
           </w:p>
@@ -7569,18 +7255,12 @@
                 <w:sz w:val="19"/>
                 <w:szCs w:val="19"/>
               </w:rPr>
-              <w:t xml:space="preserve">Product cost % excl. tax</w:t>
+              <w:t>Product cost % excl. tax</w:t>
             </w:r>
           </w:p>
         </w:tc>
       </w:tr>
       <w:tr>
-        <w:tblPrEx>
-          <w:tblCellMar>
-            <w:top w:w="0" w:type="dxa"/>
-            <w:bottom w:w="0" w:type="dxa"/>
-          </w:tblCellMar>
-        </w:tblPrEx>
         <w:trPr>
           <w:cantSplit/>
         </w:trPr>
@@ -7745,12 +7425,6 @@
         </w:tc>
       </w:tr>
       <w:tr>
-        <w:tblPrEx>
-          <w:tblCellMar>
-            <w:top w:w="0" w:type="dxa"/>
-            <w:bottom w:w="0" w:type="dxa"/>
-          </w:tblCellMar>
-        </w:tblPrEx>
         <w:trPr>
           <w:cantSplit/>
         </w:trPr>
@@ -7910,12 +7584,6 @@
         </w:tc>
       </w:tr>
       <w:tr>
-        <w:tblPrEx>
-          <w:tblCellMar>
-            <w:top w:w="0" w:type="dxa"/>
-            <w:bottom w:w="0" w:type="dxa"/>
-          </w:tblCellMar>
-        </w:tblPrEx>
         <w:trPr>
           <w:cantSplit/>
         </w:trPr>
@@ -8075,12 +7743,6 @@
         </w:tc>
       </w:tr>
       <w:tr>
-        <w:tblPrEx>
-          <w:tblCellMar>
-            <w:top w:w="0" w:type="dxa"/>
-            <w:bottom w:w="0" w:type="dxa"/>
-          </w:tblCellMar>
-        </w:tblPrEx>
         <w:trPr>
           <w:cantSplit/>
         </w:trPr>
@@ -8240,12 +7902,6 @@
         </w:tc>
       </w:tr>
       <w:tr>
-        <w:tblPrEx>
-          <w:tblCellMar>
-            <w:top w:w="0" w:type="dxa"/>
-            <w:bottom w:w="0" w:type="dxa"/>
-          </w:tblCellMar>
-        </w:tblPrEx>
         <w:trPr>
           <w:cantSplit/>
         </w:trPr>
@@ -8405,12 +8061,6 @@
         </w:tc>
       </w:tr>
       <w:tr>
-        <w:tblPrEx>
-          <w:tblCellMar>
-            <w:top w:w="0" w:type="dxa"/>
-            <w:bottom w:w="0" w:type="dxa"/>
-          </w:tblCellMar>
-        </w:tblPrEx>
         <w:trPr>
           <w:cantSplit/>
         </w:trPr>
@@ -8570,12 +8220,6 @@
         </w:tc>
       </w:tr>
       <w:tr>
-        <w:tblPrEx>
-          <w:tblCellMar>
-            <w:top w:w="0" w:type="dxa"/>
-            <w:bottom w:w="0" w:type="dxa"/>
-          </w:tblCellMar>
-        </w:tblPrEx>
         <w:trPr>
           <w:cantSplit/>
         </w:trPr>
@@ -8735,12 +8379,6 @@
         </w:tc>
       </w:tr>
       <w:tr>
-        <w:tblPrEx>
-          <w:tblCellMar>
-            <w:top w:w="0" w:type="dxa"/>
-            <w:bottom w:w="0" w:type="dxa"/>
-          </w:tblCellMar>
-        </w:tblPrEx>
         <w:trPr>
           <w:cantSplit/>
         </w:trPr>
@@ -8900,12 +8538,6 @@
         </w:tc>
       </w:tr>
       <w:tr>
-        <w:tblPrEx>
-          <w:tblCellMar>
-            <w:top w:w="0" w:type="dxa"/>
-            <w:bottom w:w="0" w:type="dxa"/>
-          </w:tblCellMar>
-        </w:tblPrEx>
         <w:trPr>
           <w:cantSplit/>
         </w:trPr>
@@ -9065,12 +8697,6 @@
         </w:tc>
       </w:tr>
       <w:tr>
-        <w:tblPrEx>
-          <w:tblCellMar>
-            <w:top w:w="0" w:type="dxa"/>
-            <w:bottom w:w="0" w:type="dxa"/>
-          </w:tblCellMar>
-        </w:tblPrEx>
         <w:trPr>
           <w:cantSplit/>
         </w:trPr>
@@ -9230,12 +8856,6 @@
         </w:tc>
       </w:tr>
       <w:tr>
-        <w:tblPrEx>
-          <w:tblCellMar>
-            <w:top w:w="0" w:type="dxa"/>
-            <w:bottom w:w="0" w:type="dxa"/>
-          </w:tblCellMar>
-        </w:tblPrEx>
         <w:trPr>
           <w:cantSplit/>
         </w:trPr>
@@ -9395,12 +9015,6 @@
         </w:tc>
       </w:tr>
       <w:tr>
-        <w:tblPrEx>
-          <w:tblCellMar>
-            <w:top w:w="0" w:type="dxa"/>
-            <w:bottom w:w="0" w:type="dxa"/>
-          </w:tblCellMar>
-        </w:tblPrEx>
         <w:trPr>
           <w:cantSplit/>
         </w:trPr>
@@ -9560,12 +9174,6 @@
         </w:tc>
       </w:tr>
       <w:tr>
-        <w:tblPrEx>
-          <w:tblCellMar>
-            <w:top w:w="0" w:type="dxa"/>
-            <w:bottom w:w="0" w:type="dxa"/>
-          </w:tblCellMar>
-        </w:tblPrEx>
         <w:trPr>
           <w:cantSplit/>
         </w:trPr>
@@ -9725,12 +9333,6 @@
         </w:tc>
       </w:tr>
       <w:tr>
-        <w:tblPrEx>
-          <w:tblCellMar>
-            <w:top w:w="0" w:type="dxa"/>
-            <w:bottom w:w="0" w:type="dxa"/>
-          </w:tblCellMar>
-        </w:tblPrEx>
         <w:trPr>
           <w:cantSplit/>
         </w:trPr>
@@ -9890,12 +9492,6 @@
         </w:tc>
       </w:tr>
       <w:tr>
-        <w:tblPrEx>
-          <w:tblCellMar>
-            <w:top w:w="0" w:type="dxa"/>
-            <w:bottom w:w="0" w:type="dxa"/>
-          </w:tblCellMar>
-        </w:tblPrEx>
         <w:trPr>
           <w:cantSplit/>
         </w:trPr>
@@ -10080,7 +9676,7 @@
         <w:t xml:space="preserve">Scale vs. efficiency. </w:t>
       </w:r>
       <w:r>
-        <w:t xml:space="preserve">The four largest categories (Electronics, Jewelry, Home Appliances, Automotive) all have the lowest margins. Electronics generates the most revenue ($41.2M) and the most reported profit ($14.1M) but keeps only 27 cents of each ex-tax dollar. Grocery keeps 51 cents but is one of the smallest categories.</w:t>
+        <w:t>The four largest categories (Electronics, Jewelry, Home Appliances, Automotive) all have the lowest margins. Electronics generates the most revenue ($41.2M) and the most reported profit ($14.1M) but keeps only 27 cents of each ex-tax dollar. Grocery keeps 51 cents but is one of the smallest categories.</w:t>
       </w:r>
     </w:p>
     <w:p>
@@ -10105,6 +9701,9 @@
         <w:jc w:val="center"/>
       </w:pPr>
       <w:r>
+        <w:rPr>
+          <w:noProof/>
+        </w:rPr>
         <w:lastRenderedPageBreak/>
         <w:drawing>
           <wp:inline distT="0" distB="0" distL="0" distR="0" wp14:anchorId="3E505EDA" wp14:editId="2C53B0E1">
@@ -10122,7 +9721,7 @@
                     <pic:cNvPicPr/>
                   </pic:nvPicPr>
                   <pic:blipFill>
-                    <a:blip r:embed="rId10"/>
+                    <a:blip r:embed="rId11"/>
                     <a:stretch>
                       <a:fillRect/>
                     </a:stretch>
@@ -10154,14 +9753,13 @@
       </w:pPr>
       <w:r>
         <w:rPr>
-          <w:rFonts w:ascii="Arial" w:hAnsi="Arial" w:cs="Arial"/>
           <w:i/>
           <w:iCs/>
           <w:color w:val="5B6270"/>
           <w:sz w:val="18"/>
           <w:szCs w:val="18"/>
         </w:rPr>
-        <w:t xml:space="preserve">Figure 3. Category margin vs. revenue.</w:t>
+        <w:t>Figure 3. Category margin vs. revenue.</w:t>
       </w:r>
     </w:p>
     <w:p>
@@ -10197,12 +9795,6 @@
         <w:gridCol w:w="1700"/>
       </w:tblGrid>
       <w:tr>
-        <w:tblPrEx>
-          <w:tblCellMar>
-            <w:top w:w="0" w:type="dxa"/>
-            <w:bottom w:w="0" w:type="dxa"/>
-          </w:tblCellMar>
-        </w:tblPrEx>
         <w:trPr>
           <w:tblHeader/>
         </w:trPr>
@@ -10376,12 +9968,6 @@
         </w:tc>
       </w:tr>
       <w:tr>
-        <w:tblPrEx>
-          <w:tblCellMar>
-            <w:top w:w="0" w:type="dxa"/>
-            <w:bottom w:w="0" w:type="dxa"/>
-          </w:tblCellMar>
-        </w:tblPrEx>
         <w:trPr>
           <w:cantSplit/>
         </w:trPr>
@@ -10540,12 +10126,6 @@
         </w:tc>
       </w:tr>
       <w:tr>
-        <w:tblPrEx>
-          <w:tblCellMar>
-            <w:top w:w="0" w:type="dxa"/>
-            <w:bottom w:w="0" w:type="dxa"/>
-          </w:tblCellMar>
-        </w:tblPrEx>
         <w:trPr>
           <w:cantSplit/>
         </w:trPr>
@@ -10704,12 +10284,6 @@
         </w:tc>
       </w:tr>
       <w:tr>
-        <w:tblPrEx>
-          <w:tblCellMar>
-            <w:top w:w="0" w:type="dxa"/>
-            <w:bottom w:w="0" w:type="dxa"/>
-          </w:tblCellMar>
-        </w:tblPrEx>
         <w:trPr>
           <w:cantSplit/>
         </w:trPr>
@@ -10868,12 +10442,6 @@
         </w:tc>
       </w:tr>
       <w:tr>
-        <w:tblPrEx>
-          <w:tblCellMar>
-            <w:top w:w="0" w:type="dxa"/>
-            <w:bottom w:w="0" w:type="dxa"/>
-          </w:tblCellMar>
-        </w:tblPrEx>
         <w:trPr>
           <w:cantSplit/>
         </w:trPr>
@@ -11032,12 +10600,6 @@
         </w:tc>
       </w:tr>
       <w:tr>
-        <w:tblPrEx>
-          <w:tblCellMar>
-            <w:top w:w="0" w:type="dxa"/>
-            <w:bottom w:w="0" w:type="dxa"/>
-          </w:tblCellMar>
-        </w:tblPrEx>
         <w:trPr>
           <w:cantSplit/>
         </w:trPr>
@@ -11196,12 +10758,6 @@
         </w:tc>
       </w:tr>
       <w:tr>
-        <w:tblPrEx>
-          <w:tblCellMar>
-            <w:top w:w="0" w:type="dxa"/>
-            <w:bottom w:w="0" w:type="dxa"/>
-          </w:tblCellMar>
-        </w:tblPrEx>
         <w:trPr>
           <w:cantSplit/>
         </w:trPr>
@@ -11360,12 +10916,6 @@
         </w:tc>
       </w:tr>
       <w:tr>
-        <w:tblPrEx>
-          <w:tblCellMar>
-            <w:top w:w="0" w:type="dxa"/>
-            <w:bottom w:w="0" w:type="dxa"/>
-          </w:tblCellMar>
-        </w:tblPrEx>
         <w:trPr>
           <w:cantSplit/>
         </w:trPr>
@@ -11524,12 +11074,6 @@
         </w:tc>
       </w:tr>
       <w:tr>
-        <w:tblPrEx>
-          <w:tblCellMar>
-            <w:top w:w="0" w:type="dxa"/>
-            <w:bottom w:w="0" w:type="dxa"/>
-          </w:tblCellMar>
-        </w:tblPrEx>
         <w:trPr>
           <w:cantSplit/>
         </w:trPr>
@@ -11699,7 +11243,7 @@
         <w:spacing w:after="140" w:line="288" w:lineRule="auto"/>
       </w:pPr>
       <w:r>
-        <w:t xml:space="preserve">Electronics brands dominate total profit through volume, but several of them (Samsung, LG, Sony, Xiaomi) have the lowest margins of any large brand, at 31.7–32.9% reported. Jewelry brands such as David Yurman and Pandora achieve similar profit with less revenue, showing stronger pricing power.</w:t>
+        <w:t>Electronics brands dominate total profit through volume, but several of them (Samsung, LG, Sony, Xiaomi) have the lowest margins of any large brand, at 31.7–32.9% reported. Jewelry brands such as David Yurman and Pandora achieve similar profit with less revenue, showing stronger pricing power.</w:t>
       </w:r>
     </w:p>
     <w:p>
@@ -11744,12 +11288,6 @@
         <w:gridCol w:w="1800"/>
       </w:tblGrid>
       <w:tr>
-        <w:tblPrEx>
-          <w:tblCellMar>
-            <w:top w:w="0" w:type="dxa"/>
-            <w:bottom w:w="0" w:type="dxa"/>
-          </w:tblCellMar>
-        </w:tblPrEx>
         <w:trPr>
           <w:tblHeader/>
         </w:trPr>
@@ -11924,12 +11462,6 @@
         </w:tc>
       </w:tr>
       <w:tr>
-        <w:tblPrEx>
-          <w:tblCellMar>
-            <w:top w:w="0" w:type="dxa"/>
-            <w:bottom w:w="0" w:type="dxa"/>
-          </w:tblCellMar>
-        </w:tblPrEx>
         <w:trPr>
           <w:cantSplit/>
         </w:trPr>
@@ -12089,12 +11621,6 @@
         </w:tc>
       </w:tr>
       <w:tr>
-        <w:tblPrEx>
-          <w:tblCellMar>
-            <w:top w:w="0" w:type="dxa"/>
-            <w:bottom w:w="0" w:type="dxa"/>
-          </w:tblCellMar>
-        </w:tblPrEx>
         <w:trPr>
           <w:cantSplit/>
         </w:trPr>
@@ -12254,12 +11780,6 @@
         </w:tc>
       </w:tr>
       <w:tr>
-        <w:tblPrEx>
-          <w:tblCellMar>
-            <w:top w:w="0" w:type="dxa"/>
-            <w:bottom w:w="0" w:type="dxa"/>
-          </w:tblCellMar>
-        </w:tblPrEx>
         <w:trPr>
           <w:cantSplit/>
         </w:trPr>
@@ -12419,12 +11939,6 @@
         </w:tc>
       </w:tr>
       <w:tr>
-        <w:tblPrEx>
-          <w:tblCellMar>
-            <w:top w:w="0" w:type="dxa"/>
-            <w:bottom w:w="0" w:type="dxa"/>
-          </w:tblCellMar>
-        </w:tblPrEx>
         <w:trPr>
           <w:cantSplit/>
         </w:trPr>
@@ -12607,6 +12121,9 @@
         <w:jc w:val="center"/>
       </w:pPr>
       <w:r>
+        <w:rPr>
+          <w:noProof/>
+        </w:rPr>
         <w:drawing>
           <wp:inline distT="0" distB="0" distL="0" distR="0" wp14:anchorId="5C972AE8" wp14:editId="2E55F76D">
             <wp:extent cx="4762535" cy="3619526"/>
@@ -12623,7 +12140,7 @@
                     <pic:cNvPicPr/>
                   </pic:nvPicPr>
                   <pic:blipFill>
-                    <a:blip r:embed="rId11"/>
+                    <a:blip r:embed="rId12"/>
                     <a:stretch>
                       <a:fillRect/>
                     </a:stretch>
@@ -12655,14 +12172,13 @@
       </w:pPr>
       <w:r>
         <w:rPr>
-          <w:rFonts w:ascii="Arial" w:hAnsi="Arial" w:cs="Arial"/>
           <w:i/>
           <w:iCs/>
           <w:color w:val="5B6270"/>
           <w:sz w:val="18"/>
           <w:szCs w:val="18"/>
         </w:rPr>
-        <w:t xml:space="preserve">Figure 4. Customer share vs. revenue share by segment.</w:t>
+        <w:t>Figure 4. Customer share vs. revenue share by segment.</w:t>
       </w:r>
     </w:p>
     <w:p>
@@ -12700,12 +12216,6 @@
         <w:gridCol w:w="1800"/>
       </w:tblGrid>
       <w:tr>
-        <w:tblPrEx>
-          <w:tblCellMar>
-            <w:top w:w="0" w:type="dxa"/>
-            <w:bottom w:w="0" w:type="dxa"/>
-          </w:tblCellMar>
-        </w:tblPrEx>
         <w:trPr>
           <w:tblHeader/>
         </w:trPr>
@@ -12914,12 +12424,6 @@
         </w:tc>
       </w:tr>
       <w:tr>
-        <w:tblPrEx>
-          <w:tblCellMar>
-            <w:top w:w="0" w:type="dxa"/>
-            <w:bottom w:w="0" w:type="dxa"/>
-          </w:tblCellMar>
-        </w:tblPrEx>
         <w:trPr>
           <w:cantSplit/>
         </w:trPr>
@@ -13110,12 +12614,6 @@
         </w:tc>
       </w:tr>
       <w:tr>
-        <w:tblPrEx>
-          <w:tblCellMar>
-            <w:top w:w="0" w:type="dxa"/>
-            <w:bottom w:w="0" w:type="dxa"/>
-          </w:tblCellMar>
-        </w:tblPrEx>
         <w:trPr>
           <w:cantSplit/>
         </w:trPr>
@@ -13318,7 +12816,7 @@
         <w:spacing w:after="140" w:line="288" w:lineRule="auto"/>
       </w:pPr>
       <w:r>
-        <w:t xml:space="preserve">Repeat customers are worth about six times more than one-time customers, but not because they spend more per order: value per order is almost identical. The entire gap comes from order frequency. With 98.7% of customers already returning, there is little room to improve retention itself; the opportunity is getting existing customers to order more often.</w:t>
+        <w:t>Repeat customers are worth about six times more than one-time customers, but not because they spend more per order: value per order is almost identical. The entire gap comes from order frequency. With 98.7% of customers already returning, there is little room to improve retention itself; the opportunity is getting existing customers to order more often.</w:t>
       </w:r>
     </w:p>
     <w:p>
@@ -13349,6 +12847,9 @@
         <w:jc w:val="center"/>
       </w:pPr>
       <w:r>
+        <w:rPr>
+          <w:noProof/>
+        </w:rPr>
         <w:drawing>
           <wp:inline distT="0" distB="0" distL="0" distR="0" wp14:anchorId="45A186F1" wp14:editId="6291AA94">
             <wp:extent cx="5943600" cy="2874645"/>
@@ -13365,7 +12866,7 @@
                     <pic:cNvPicPr/>
                   </pic:nvPicPr>
                   <pic:blipFill>
-                    <a:blip r:embed="rId12"/>
+                    <a:blip r:embed="rId13"/>
                     <a:stretch>
                       <a:fillRect/>
                     </a:stretch>
@@ -13398,14 +12899,13 @@
       </w:pPr>
       <w:r>
         <w:rPr>
-          <w:rFonts w:ascii="Arial" w:hAnsi="Arial" w:cs="Arial"/>
           <w:i/>
           <w:iCs/>
           <w:color w:val="5B6270"/>
           <w:sz w:val="18"/>
           <w:szCs w:val="18"/>
         </w:rPr>
-        <w:t xml:space="preserve">Figure 5. Repeat vs. one-time customers.</w:t>
+        <w:t>Figure 5. Repeat vs. one-time customers.</w:t>
       </w:r>
     </w:p>
     <w:p/>
@@ -13452,12 +12952,6 @@
         <w:gridCol w:w="1800"/>
       </w:tblGrid>
       <w:tr>
-        <w:tblPrEx>
-          <w:tblCellMar>
-            <w:top w:w="0" w:type="dxa"/>
-            <w:bottom w:w="0" w:type="dxa"/>
-          </w:tblCellMar>
-        </w:tblPrEx>
         <w:trPr>
           <w:tblHeader/>
         </w:trPr>
@@ -13632,12 +13126,6 @@
         </w:tc>
       </w:tr>
       <w:tr>
-        <w:tblPrEx>
-          <w:tblCellMar>
-            <w:top w:w="0" w:type="dxa"/>
-            <w:bottom w:w="0" w:type="dxa"/>
-          </w:tblCellMar>
-        </w:tblPrEx>
         <w:trPr>
           <w:cantSplit/>
         </w:trPr>
@@ -13797,12 +13285,6 @@
         </w:tc>
       </w:tr>
       <w:tr>
-        <w:tblPrEx>
-          <w:tblCellMar>
-            <w:top w:w="0" w:type="dxa"/>
-            <w:bottom w:w="0" w:type="dxa"/>
-          </w:tblCellMar>
-        </w:tblPrEx>
         <w:trPr>
           <w:cantSplit/>
         </w:trPr>
@@ -13962,12 +13444,6 @@
         </w:tc>
       </w:tr>
       <w:tr>
-        <w:tblPrEx>
-          <w:tblCellMar>
-            <w:top w:w="0" w:type="dxa"/>
-            <w:bottom w:w="0" w:type="dxa"/>
-          </w:tblCellMar>
-        </w:tblPrEx>
         <w:trPr>
           <w:cantSplit/>
         </w:trPr>
@@ -14127,12 +13603,6 @@
         </w:tc>
       </w:tr>
       <w:tr>
-        <w:tblPrEx>
-          <w:tblCellMar>
-            <w:top w:w="0" w:type="dxa"/>
-            <w:bottom w:w="0" w:type="dxa"/>
-          </w:tblCellMar>
-        </w:tblPrEx>
         <w:trPr>
           <w:cantSplit/>
         </w:trPr>
@@ -14292,12 +13762,6 @@
         </w:tc>
       </w:tr>
       <w:tr>
-        <w:tblPrEx>
-          <w:tblCellMar>
-            <w:top w:w="0" w:type="dxa"/>
-            <w:bottom w:w="0" w:type="dxa"/>
-          </w:tblCellMar>
-        </w:tblPrEx>
         <w:trPr>
           <w:cantSplit/>
         </w:trPr>
@@ -14457,12 +13921,6 @@
         </w:tc>
       </w:tr>
       <w:tr>
-        <w:tblPrEx>
-          <w:tblCellMar>
-            <w:top w:w="0" w:type="dxa"/>
-            <w:bottom w:w="0" w:type="dxa"/>
-          </w:tblCellMar>
-        </w:tblPrEx>
         <w:trPr>
           <w:cantSplit/>
         </w:trPr>
@@ -14622,12 +14080,6 @@
         </w:tc>
       </w:tr>
       <w:tr>
-        <w:tblPrEx>
-          <w:tblCellMar>
-            <w:top w:w="0" w:type="dxa"/>
-            <w:bottom w:w="0" w:type="dxa"/>
-          </w:tblCellMar>
-        </w:tblPrEx>
         <w:trPr>
           <w:cantSplit/>
         </w:trPr>
@@ -14787,12 +14239,6 @@
         </w:tc>
       </w:tr>
       <w:tr>
-        <w:tblPrEx>
-          <w:tblCellMar>
-            <w:top w:w="0" w:type="dxa"/>
-            <w:bottom w:w="0" w:type="dxa"/>
-          </w:tblCellMar>
-        </w:tblPrEx>
         <w:trPr>
           <w:cantSplit/>
         </w:trPr>
@@ -14952,12 +14398,6 @@
         </w:tc>
       </w:tr>
       <w:tr>
-        <w:tblPrEx>
-          <w:tblCellMar>
-            <w:top w:w="0" w:type="dxa"/>
-            <w:bottom w:w="0" w:type="dxa"/>
-          </w:tblCellMar>
-        </w:tblPrEx>
         <w:trPr>
           <w:cantSplit/>
         </w:trPr>
@@ -15117,12 +14557,6 @@
         </w:tc>
       </w:tr>
       <w:tr>
-        <w:tblPrEx>
-          <w:tblCellMar>
-            <w:top w:w="0" w:type="dxa"/>
-            <w:bottom w:w="0" w:type="dxa"/>
-          </w:tblCellMar>
-        </w:tblPrEx>
         <w:trPr>
           <w:cantSplit/>
         </w:trPr>
@@ -15295,7 +14729,7 @@
         <w:spacing w:after="140" w:line="288" w:lineRule="auto"/>
       </w:pPr>
       <w:r>
-        <w:t xml:space="preserve">Every channel earns between 36.7% and 37.2% excluding tax, a spread of less than half a point. Channel choice does not drive profitability. Budget decisions should therefore be based on customer acquisition costs and volume, which this dataset does not include, rather than on margin.</w:t>
+        <w:t>Every channel earns between 36.7% and 37.2% excluding tax, a spread of less than half a point. Channel choice does not drive profitability. Budget decisions should therefore be based on customer acquisition costs and volume, which this dataset does not include, rather than on margin.</w:t>
       </w:r>
     </w:p>
     <w:p>
@@ -15310,6 +14744,9 @@
         <w:jc w:val="center"/>
       </w:pPr>
       <w:r>
+        <w:rPr>
+          <w:noProof/>
+        </w:rPr>
         <w:lastRenderedPageBreak/>
         <w:drawing>
           <wp:inline distT="0" distB="0" distL="0" distR="0" wp14:anchorId="1E9A0302" wp14:editId="157231CE">
@@ -15327,7 +14764,7 @@
                     <pic:cNvPicPr/>
                   </pic:nvPicPr>
                   <pic:blipFill>
-                    <a:blip r:embed="rId13"/>
+                    <a:blip r:embed="rId14"/>
                     <a:stretch>
                       <a:fillRect/>
                     </a:stretch>
@@ -15346,6 +14783,8 @@
             </a:graphic>
           </wp:inline>
         </w:drawing>
+      </w:r>
+      <w:r>
         <w:t xml:space="preserve"> </w:t>
       </w:r>
     </w:p>
@@ -15360,14 +14799,13 @@
       </w:pPr>
       <w:r>
         <w:rPr>
-          <w:rFonts w:ascii="Arial" w:hAnsi="Arial" w:cs="Arial"/>
           <w:i/>
           <w:iCs/>
           <w:color w:val="5B6270"/>
           <w:sz w:val="18"/>
           <w:szCs w:val="18"/>
         </w:rPr>
-        <w:t xml:space="preserve">Figure 6. Profit margin excl. sales tax by marketing channel.</w:t>
+        <w:t>Figure 6. Profit margin excl. sales tax by marketing channel.</w:t>
       </w:r>
     </w:p>
     <w:p>
@@ -15391,7 +14829,7 @@
         <w:spacing w:after="140" w:line="288" w:lineRule="auto"/>
       </w:pPr>
       <w:r>
-        <w:t xml:space="preserve">Returned orders still carry their full sales and profit in the data: $6.93M reported profit comes from returned orders, which also have a higher average value ($1,392 vs. $1,274). This suggests the dataset does not reverse revenue or profit for returns. If these orders were refunded, reported profit is overstated further.</w:t>
+        <w:t>Returned orders still carry their full sales and profit in the data: $6.93M reported profit comes from returned orders, which also have a higher average value ($1,392 vs. $1,274). This suggests the dataset does not reverse revenue or profit for returns. If these orders were refunded, reported profit is overstated further.</w:t>
       </w:r>
     </w:p>
     <w:p>
@@ -15437,7 +14875,7 @@
         <w:t xml:space="preserve">Action: </w:t>
       </w:r>
       <w:r>
-        <w:t xml:space="preserve">Report revenue and profit excluding sales tax, and net out refunded returns. Do not shift resources between regions, or try to “replicate North’s model”, based on the reported margins.</w:t>
+        <w:t>Report revenue and profit excluding sales tax, and net out refunded returns. Do not shift resources between regions, or try to “replicate North’s model”, based on the reported margins.</w:t>
       </w:r>
     </w:p>
     <w:p>
@@ -15739,7 +15177,7 @@
         <w:spacing w:after="140" w:line="288" w:lineRule="auto"/>
       </w:pPr>
       <w:r>
-        <w:t xml:space="preserve">All queries are in ecommerce_profitability_analysis.sql, organized as follows:</w:t>
+        <w:t>All queries are in ecommerce_profitability_analysis.sql, organized as follows:</w:t>
       </w:r>
     </w:p>
     <w:tbl>
@@ -15764,12 +15202,6 @@
         <w:gridCol w:w="7560"/>
       </w:tblGrid>
       <w:tr>
-        <w:tblPrEx>
-          <w:tblCellMar>
-            <w:top w:w="0" w:type="dxa"/>
-            <w:bottom w:w="0" w:type="dxa"/>
-          </w:tblCellMar>
-        </w:tblPrEx>
         <w:trPr>
           <w:tblHeader/>
         </w:trPr>
@@ -15841,12 +15273,6 @@
         </w:tc>
       </w:tr>
       <w:tr>
-        <w:tblPrEx>
-          <w:tblCellMar>
-            <w:top w:w="0" w:type="dxa"/>
-            <w:bottom w:w="0" w:type="dxa"/>
-          </w:tblCellMar>
-        </w:tblPrEx>
         <w:trPr>
           <w:cantSplit/>
         </w:trPr>
@@ -15912,12 +15338,6 @@
         </w:tc>
       </w:tr>
       <w:tr>
-        <w:tblPrEx>
-          <w:tblCellMar>
-            <w:top w:w="0" w:type="dxa"/>
-            <w:bottom w:w="0" w:type="dxa"/>
-          </w:tblCellMar>
-        </w:tblPrEx>
         <w:trPr>
           <w:cantSplit/>
         </w:trPr>
@@ -15983,12 +15403,6 @@
         </w:tc>
       </w:tr>
       <w:tr>
-        <w:tblPrEx>
-          <w:tblCellMar>
-            <w:top w:w="0" w:type="dxa"/>
-            <w:bottom w:w="0" w:type="dxa"/>
-          </w:tblCellMar>
-        </w:tblPrEx>
         <w:trPr>
           <w:cantSplit/>
         </w:trPr>
@@ -16054,12 +15468,6 @@
         </w:tc>
       </w:tr>
       <w:tr>
-        <w:tblPrEx>
-          <w:tblCellMar>
-            <w:top w:w="0" w:type="dxa"/>
-            <w:bottom w:w="0" w:type="dxa"/>
-          </w:tblCellMar>
-        </w:tblPrEx>
         <w:trPr>
           <w:cantSplit/>
         </w:trPr>
@@ -16125,12 +15533,6 @@
         </w:tc>
       </w:tr>
       <w:tr>
-        <w:tblPrEx>
-          <w:tblCellMar>
-            <w:top w:w="0" w:type="dxa"/>
-            <w:bottom w:w="0" w:type="dxa"/>
-          </w:tblCellMar>
-        </w:tblPrEx>
         <w:trPr>
           <w:cantSplit/>
         </w:trPr>
@@ -16196,12 +15598,6 @@
         </w:tc>
       </w:tr>
       <w:tr>
-        <w:tblPrEx>
-          <w:tblCellMar>
-            <w:top w:w="0" w:type="dxa"/>
-            <w:bottom w:w="0" w:type="dxa"/>
-          </w:tblCellMar>
-        </w:tblPrEx>
         <w:trPr>
           <w:cantSplit/>
         </w:trPr>
@@ -16267,12 +15663,6 @@
         </w:tc>
       </w:tr>
       <w:tr>
-        <w:tblPrEx>
-          <w:tblCellMar>
-            <w:top w:w="0" w:type="dxa"/>
-            <w:bottom w:w="0" w:type="dxa"/>
-          </w:tblCellMar>
-        </w:tblPrEx>
         <w:trPr>
           <w:cantSplit/>
         </w:trPr>
@@ -16338,12 +15728,6 @@
         </w:tc>
       </w:tr>
       <w:tr>
-        <w:tblPrEx>
-          <w:tblCellMar>
-            <w:top w:w="0" w:type="dxa"/>
-            <w:bottom w:w="0" w:type="dxa"/>
-          </w:tblCellMar>
-        </w:tblPrEx>
         <w:trPr>
           <w:cantSplit/>
         </w:trPr>
@@ -16409,12 +15793,6 @@
         </w:tc>
       </w:tr>
       <w:tr>
-        <w:tblPrEx>
-          <w:tblCellMar>
-            <w:top w:w="0" w:type="dxa"/>
-            <w:bottom w:w="0" w:type="dxa"/>
-          </w:tblCellMar>
-        </w:tblPrEx>
         <w:trPr>
           <w:cantSplit/>
         </w:trPr>
@@ -16490,7 +15868,7 @@
       </w:r>
     </w:p>
     <w:sectPr>
-      <w:footerReference w:type="default" r:id="rId14"/>
+      <w:footerReference w:type="default" r:id="rId15"/>
       <w:pgSz w:w="12240" w:h="15840"/>
       <w:pgMar w:top="1440" w:right="1440" w:bottom="1440" w:left="1440" w:header="708" w:footer="708" w:gutter="0"/>
       <w:cols w:space="720"/>

</xml_diff>